<commit_message>
Feat: finished writing my summary and re-exported it to pdf
</commit_message>
<xml_diff>
--- a/Homework 2 Summary.docx
+++ b/Homework 2 Summary.docx
@@ -6,16 +6,11 @@
       <w:r>
         <w:t xml:space="preserve">Ellen Hill – CPSC 224 – Homework </w:t>
       </w:r>
-      <w:proofErr w:type="gramStart"/>
       <w:r>
         <w:t>2</w:t>
       </w:r>
       <w:r>
-        <w:t xml:space="preserve"> :</w:t>
-      </w:r>
-      <w:proofErr w:type="gramEnd"/>
-      <w:r>
-        <w:t xml:space="preserve"> Farkle </w:t>
+        <w:t xml:space="preserve"> : Farkle </w:t>
       </w:r>
       <w:r>
         <w:t>Rerolling and Niceties</w:t>
@@ -27,15 +22,7 @@
         <w:t xml:space="preserve">The intent of this project was to </w:t>
       </w:r>
       <w:r>
-        <w:t xml:space="preserve">build upon our work from the first homework, adding in new features and loops to our code to improve the experience for players. We were required to add a game banner, a player name, the option to early quit, rolling </w:t>
-      </w:r>
-      <w:proofErr w:type="spellStart"/>
-      <w:r>
-        <w:t>unmelded</w:t>
-      </w:r>
-      <w:proofErr w:type="spellEnd"/>
-      <w:r>
-        <w:t xml:space="preserve"> dice, hand handle the hot hands rules for Farkle.</w:t>
+        <w:t>build upon our work from the first homework, adding in new features and loops to our code to improve the experience for players. We were required to add a game banner, a player name, the option to early quit, rolling unmelded dice, hand handle the hot hands rules for Farkle.</w:t>
       </w:r>
     </w:p>
     <w:p>
@@ -44,37 +31,13 @@
         <w:t xml:space="preserve">My coding style Is to write the program all in main to ensure it works </w:t>
       </w:r>
       <w:r>
-        <w:t xml:space="preserve">with </w:t>
-      </w:r>
-      <w:proofErr w:type="gramStart"/>
-      <w:r>
-        <w:t>all of</w:t>
-      </w:r>
-      <w:proofErr w:type="gramEnd"/>
-      <w:r>
-        <w:t xml:space="preserve"> the variables </w:t>
-      </w:r>
-      <w:proofErr w:type="gramStart"/>
-      <w:r>
-        <w:t>available</w:t>
-      </w:r>
-      <w:proofErr w:type="gramEnd"/>
-      <w:r>
-        <w:t xml:space="preserve"> so I don’t have to worry about scope. This time, I started my work by classifying many of my functions from before and it made my main so much cleaner! It became easier to debug once most of the printing was outsourced to printing functions. k</w:t>
+        <w:t>with all of the variables available so I don’t have to worry about scope. This time, I started my work by classifying many of my functions from before and it made my main so much cleaner! It became easier to debug once most of the printing was outsourced to printing functions. k</w:t>
       </w:r>
       <w:r>
         <w:t xml:space="preserve">eeping the project concise. </w:t>
       </w:r>
       <w:r>
-        <w:t xml:space="preserve">I would be interested to see how other people split up their code and functions, especially the loops because those got </w:t>
-      </w:r>
-      <w:proofErr w:type="gramStart"/>
-      <w:r>
-        <w:t>really confusing</w:t>
-      </w:r>
-      <w:proofErr w:type="gramEnd"/>
-      <w:r>
-        <w:t>!</w:t>
+        <w:t>I would be interested to see how other people split up their code and functions, especially the loops because those got really confusing!</w:t>
       </w:r>
       <w:r>
         <w:t xml:space="preserve"> </w:t>
@@ -86,15 +49,7 @@
         <w:t xml:space="preserve">The </w:t>
       </w:r>
       <w:r>
-        <w:t xml:space="preserve">hot hands handling was more complex </w:t>
-      </w:r>
-      <w:proofErr w:type="gramStart"/>
-      <w:r>
-        <w:t>then</w:t>
-      </w:r>
-      <w:proofErr w:type="gramEnd"/>
-      <w:r>
-        <w:t xml:space="preserve"> I gave it credit for, especially when I started addressing bugs that I didn’t notice last time. Hot hands needed to trigger </w:t>
+        <w:t xml:space="preserve">hot hands handling was more complex then I gave it credit for, especially when I started addressing bugs that I didn’t notice last time. Hot hands needed to trigger </w:t>
       </w:r>
       <w:r>
         <w:t>both</w:t>
@@ -109,15 +64,16 @@
         <w:t xml:space="preserve">If I’d had more time, </w:t>
       </w:r>
       <w:r>
-        <w:t xml:space="preserve">I would have spent more time breaking up my </w:t>
-      </w:r>
-      <w:proofErr w:type="gramStart"/>
-      <w:r>
-        <w:t>main</w:t>
-      </w:r>
-      <w:proofErr w:type="gramEnd"/>
-      <w:r>
-        <w:t xml:space="preserve"> into functions so that it would be more readable. I was very happy with this project output and found myself address bugs that I would normally let slide. I came into this project with a player focused mindset, so anything that I thought would be frustrating as a player, I tried to address. </w:t>
+        <w:t xml:space="preserve">I would have spent more time breaking up my main into functions so that it would be more readable. I was very happy with this project output and found myself address bugs that I would normally let slide. I came into this project with a player focused mindset, so anything that I thought would be frustrating as a player, I tried to address. </w:t>
+      </w:r>
+    </w:p>
+    <w:p>
+      <w:r>
+        <w:tab/>
+        <w:t>Additionally, our professor noted that since she had not taught us how to do tests in class, she would tell the TA’s not to grade for them</w:t>
+      </w:r>
+      <w:r>
+        <w:t>. If we had more time (and class time teaching) I would love to implement the tests for readability and coding professionalism, but I understand there is a lot of material in this class to cover so I’ll shrug it off for now.</w:t>
       </w:r>
     </w:p>
     <w:p>

</xml_diff>